<commit_message>
chore: update 2026 resume template
</commit_message>
<xml_diff>
--- a/resources/resume/2026 template.docx
+++ b/resources/resume/2026 template.docx
@@ -6,17 +6,21 @@
       <w:pPr>
         <w:pStyle w:val="Title"/>
         <w:rPr>
-          <w:caps/>
-          <w:color w:val="156082" w:themeColor="accent1"/>
+          <w:caps w:val="0"/>
         </w:rPr>
       </w:pPr>
       <w:bookmarkStart w:id="0" w:name="_Hlk211971945"/>
       <w:r>
+        <w:t>{</w:t>
+      </w:r>
+      <w:r>
         <w:rPr>
-          <w:caps/>
-          <w:color w:val="156082" w:themeColor="accent1"/>
+          <w:caps w:val="0"/>
         </w:rPr>
-        <w:t>{name}</w:t>
+        <w:t>name</w:t>
+      </w:r>
+      <w:r>
+        <w:t>}</w:t>
       </w:r>
     </w:p>
     <w:p>
@@ -1143,14 +1147,13 @@
     <w:name w:val="heading 1"/>
     <w:uiPriority w:val="9"/>
     <w:qFormat/>
-    <w:rsid w:val="00141C4C"/>
+    <w:rsid w:val="00C1694D"/>
     <w:pPr>
       <w:keepNext/>
       <w:pBdr>
         <w:bottom w:val="single" w:sz="6" w:space="0" w:color="B35E06"/>
       </w:pBdr>
       <w:spacing w:before="240" w:after="120"/>
-      <w:jc w:val="center"/>
       <w:outlineLvl w:val="0"/>
     </w:pPr>
     <w:rPr>
@@ -1178,7 +1181,6 @@
         <w:bottom w:val="none" w:sz="0" w:space="0" w:color="auto"/>
       </w:pBdr>
       <w:spacing w:before="180" w:after="80"/>
-      <w:jc w:val="left"/>
       <w:outlineLvl w:val="1"/>
     </w:pPr>
     <w:rPr>
@@ -1275,16 +1277,17 @@
     <w:link w:val="TitleChar"/>
     <w:uiPriority w:val="10"/>
     <w:qFormat/>
-    <w:rsid w:val="002C56E2"/>
+    <w:rsid w:val="00C1694D"/>
     <w:pPr>
       <w:spacing w:after="120"/>
       <w:jc w:val="center"/>
     </w:pPr>
     <w:rPr>
-      <w:rFonts w:ascii="Josefin Sans" w:hAnsi="Josefin Sans"/>
+      <w:rFonts w:ascii="Josefin Sans Bold" w:hAnsi="Josefin Sans Bold"/>
       <w:b/>
       <w:bCs/>
-      <w:color w:val="000000"/>
+      <w:caps/>
+      <w:color w:val="B35E06"/>
       <w:sz w:val="32"/>
       <w:szCs w:val="32"/>
     </w:rPr>
@@ -1429,7 +1432,7 @@
     <w:link w:val="HeaderChar"/>
     <w:uiPriority w:val="99"/>
     <w:unhideWhenUsed/>
-    <w:rsid w:val="00B520ED"/>
+    <w:rsid w:val="00C1694D"/>
     <w:pPr>
       <w:pBdr>
         <w:bottom w:val="single" w:sz="4" w:space="1" w:color="156082" w:themeColor="accent1"/>
@@ -1437,7 +1440,7 @@
       <w:jc w:val="center"/>
     </w:pPr>
     <w:rPr>
-      <w:color w:val="156082" w:themeColor="accent1"/>
+      <w:color w:val="1B587C"/>
       <w:sz w:val="18"/>
       <w:szCs w:val="18"/>
     </w:rPr>
@@ -1447,9 +1450,9 @@
     <w:basedOn w:val="DefaultParagraphFont"/>
     <w:link w:val="Header"/>
     <w:uiPriority w:val="99"/>
-    <w:rsid w:val="00B520ED"/>
-    <w:rPr>
-      <w:color w:val="156082" w:themeColor="accent1"/>
+    <w:rsid w:val="00C1694D"/>
+    <w:rPr>
+      <w:color w:val="1B587C"/>
       <w:sz w:val="18"/>
       <w:szCs w:val="18"/>
     </w:rPr>
@@ -1530,12 +1533,13 @@
     <w:basedOn w:val="DefaultParagraphFont"/>
     <w:link w:val="Title"/>
     <w:uiPriority w:val="10"/>
-    <w:rsid w:val="008B520F"/>
-    <w:rPr>
-      <w:rFonts w:ascii="Josefin Sans" w:hAnsi="Josefin Sans"/>
+    <w:rsid w:val="00C1694D"/>
+    <w:rPr>
+      <w:rFonts w:ascii="Josefin Sans Bold" w:hAnsi="Josefin Sans Bold"/>
       <w:b/>
       <w:bCs/>
-      <w:color w:val="000000"/>
+      <w:caps/>
+      <w:color w:val="B35E06"/>
       <w:sz w:val="32"/>
       <w:szCs w:val="32"/>
     </w:rPr>

</xml_diff>